<commit_message>
Update Contact Entity PRD: 4 pending changes applied
1. Add applicationDeclineReason field (7-value reconciled enum, MR-RECON-DEC-002)
2. Update departure field visibility: mentorStatus in [Resigned, Departed]
3. Allow manual admin override for trainingCompleted/trainingCompletionDate
4. Add mentor-level analytics fields (totalLifetimeSessions, totalMentoringHours, totalSessionsLast30Days)
</commit_message>
<xml_diff>
--- a/PRDs/entities/Contact-Entity-PRD.docx
+++ b/PRDs/entities/Contact-Entity-PRD.docx
@@ -439,7 +439,7 @@
                 <w:sz w:val="20"/>
                 <w:szCs w:val="20"/>
               </w:rPr>
-              <w:t xml:space="preserve">04-01-26 21:00</w:t>
+              <w:t xml:space="preserve">04-05-26 22:00</w:t>
             </w:r>
           </w:p>
         </w:tc>
@@ -13785,7 +13785,7 @@
                 <w:sz w:val="20"/>
                 <w:szCs w:val="20"/>
               </w:rPr>
-              <w:t xml:space="preserve">System-populated via learning management system integration when required training is completed. Mentor can see their own status. </w:t>
+              <w:t xml:space="preserve">System-populated via learning management system integration when required training is completed. May also be manually set by the Mentor Administrator as a fallback when LMS integration is unavailable. Mentor can see their own status. </w:t>
             </w:r>
             <w:r>
               <w:rPr>
@@ -13837,7 +13837,7 @@
                 <w:sz w:val="20"/>
                 <w:szCs w:val="20"/>
               </w:rPr>
-              <w:t xml:space="preserve">system-populated, readOnly.</w:t>
+              <w:t xml:space="preserve">system-populated or manually set by Mentor Administrator.</w:t>
             </w:r>
           </w:p>
         </w:tc>
@@ -14061,7 +14061,7 @@
                 <w:sz w:val="20"/>
                 <w:szCs w:val="20"/>
               </w:rPr>
-              <w:t xml:space="preserve">Date required training was completed. System-populated via LMS integration. </w:t>
+              <w:t xml:space="preserve">Date required training was completed. System-populated via LMS integration or manually set by the Mentor Administrator as a fallback. </w:t>
             </w:r>
             <w:r>
               <w:rPr>
@@ -14113,7 +14113,7 @@
                 <w:sz w:val="20"/>
                 <w:szCs w:val="20"/>
               </w:rPr>
-              <w:t xml:space="preserve">system-populated, readOnly.</w:t>
+              <w:t xml:space="preserve">system-populated or manually set by Mentor Administrator.</w:t>
             </w:r>
           </w:p>
         </w:tc>
@@ -14966,6 +14966,1605 @@
           <w:sz w:val="22"/>
           <w:szCs w:val="22"/>
         </w:rPr>
+        <w:t xml:space="preserve">Application</w:t>
+      </w:r>
+    </w:p>
+    <w:tbl>
+      <w:tblPr>
+        <w:tblW w:type="dxa" w:w="9360"/>
+        <w:tblBorders>
+          <w:top w:val="single" w:color="auto" w:sz="4"/>
+          <w:left w:val="single" w:color="auto" w:sz="4"/>
+          <w:bottom w:val="single" w:color="auto" w:sz="4"/>
+          <w:right w:val="single" w:color="auto" w:sz="4"/>
+          <w:insideH w:val="single" w:color="auto" w:sz="4"/>
+          <w:insideV w:val="single" w:color="auto" w:sz="4"/>
+        </w:tblBorders>
+      </w:tblPr>
+      <w:tblGrid>
+        <w:gridCol w:w="2200"/>
+        <w:gridCol w:w="1100"/>
+        <w:gridCol w:w="800"/>
+        <w:gridCol w:w="2400"/>
+        <w:gridCol w:w="1000"/>
+        <w:gridCol w:w="1860"/>
+      </w:tblGrid>
+      <w:tr>
+        <w:tc>
+          <w:tcPr>
+            <w:tcW w:type="dxa" w:w="2200"/>
+            <w:tcBorders>
+              <w:top w:val="single" w:color="AAAAAA" w:sz="1"/>
+              <w:left w:val="single" w:color="AAAAAA" w:sz="1"/>
+              <w:bottom w:val="single" w:color="AAAAAA" w:sz="1"/>
+              <w:right w:val="single" w:color="AAAAAA" w:sz="1"/>
+            </w:tcBorders>
+            <w:shd w:fill="1F3864" w:val="clear"/>
+            <w:tcMar>
+              <w:top w:type="dxa" w:w="60"/>
+              <w:left w:type="dxa" w:w="100"/>
+              <w:bottom w:type="dxa" w:w="60"/>
+              <w:right w:type="dxa" w:w="100"/>
+            </w:tcMar>
+          </w:tcPr>
+          <w:p>
+            <w:r>
+              <w:rPr>
+                <w:rFonts w:ascii="Arial" w:cs="Arial" w:eastAsia="Arial" w:hAnsi="Arial"/>
+                <w:b/>
+                <w:bCs/>
+                <w:i w:val="false"/>
+                <w:iCs w:val="false"/>
+                <w:color w:val="FFFFFF"/>
+                <w:sz w:val="20"/>
+                <w:szCs w:val="20"/>
+              </w:rPr>
+              <w:t xml:space="preserve">Field Name</w:t>
+            </w:r>
+          </w:p>
+        </w:tc>
+        <w:tc>
+          <w:tcPr>
+            <w:tcW w:type="dxa" w:w="1100"/>
+            <w:tcBorders>
+              <w:top w:val="single" w:color="AAAAAA" w:sz="1"/>
+              <w:left w:val="single" w:color="AAAAAA" w:sz="1"/>
+              <w:bottom w:val="single" w:color="AAAAAA" w:sz="1"/>
+              <w:right w:val="single" w:color="AAAAAA" w:sz="1"/>
+            </w:tcBorders>
+            <w:shd w:fill="1F3864" w:val="clear"/>
+            <w:tcMar>
+              <w:top w:type="dxa" w:w="60"/>
+              <w:left w:type="dxa" w:w="100"/>
+              <w:bottom w:type="dxa" w:w="60"/>
+              <w:right w:type="dxa" w:w="100"/>
+            </w:tcMar>
+          </w:tcPr>
+          <w:p>
+            <w:r>
+              <w:rPr>
+                <w:rFonts w:ascii="Arial" w:cs="Arial" w:eastAsia="Arial" w:hAnsi="Arial"/>
+                <w:b/>
+                <w:bCs/>
+                <w:i w:val="false"/>
+                <w:iCs w:val="false"/>
+                <w:color w:val="FFFFFF"/>
+                <w:sz w:val="20"/>
+                <w:szCs w:val="20"/>
+              </w:rPr>
+              <w:t xml:space="preserve">Type</w:t>
+            </w:r>
+          </w:p>
+        </w:tc>
+        <w:tc>
+          <w:tcPr>
+            <w:tcW w:type="dxa" w:w="800"/>
+            <w:tcBorders>
+              <w:top w:val="single" w:color="AAAAAA" w:sz="1"/>
+              <w:left w:val="single" w:color="AAAAAA" w:sz="1"/>
+              <w:bottom w:val="single" w:color="AAAAAA" w:sz="1"/>
+              <w:right w:val="single" w:color="AAAAAA" w:sz="1"/>
+            </w:tcBorders>
+            <w:shd w:fill="1F3864" w:val="clear"/>
+            <w:tcMar>
+              <w:top w:type="dxa" w:w="60"/>
+              <w:left w:type="dxa" w:w="100"/>
+              <w:bottom w:type="dxa" w:w="60"/>
+              <w:right w:type="dxa" w:w="100"/>
+            </w:tcMar>
+          </w:tcPr>
+          <w:p>
+            <w:r>
+              <w:rPr>
+                <w:rFonts w:ascii="Arial" w:cs="Arial" w:eastAsia="Arial" w:hAnsi="Arial"/>
+                <w:b/>
+                <w:bCs/>
+                <w:i w:val="false"/>
+                <w:iCs w:val="false"/>
+                <w:color w:val="FFFFFF"/>
+                <w:sz w:val="20"/>
+                <w:szCs w:val="20"/>
+              </w:rPr>
+              <w:t xml:space="preserve">Required</w:t>
+            </w:r>
+          </w:p>
+        </w:tc>
+        <w:tc>
+          <w:tcPr>
+            <w:tcW w:type="dxa" w:w="2400"/>
+            <w:tcBorders>
+              <w:top w:val="single" w:color="AAAAAA" w:sz="1"/>
+              <w:left w:val="single" w:color="AAAAAA" w:sz="1"/>
+              <w:bottom w:val="single" w:color="AAAAAA" w:sz="1"/>
+              <w:right w:val="single" w:color="AAAAAA" w:sz="1"/>
+            </w:tcBorders>
+            <w:shd w:fill="1F3864" w:val="clear"/>
+            <w:tcMar>
+              <w:top w:type="dxa" w:w="60"/>
+              <w:left w:type="dxa" w:w="100"/>
+              <w:bottom w:type="dxa" w:w="60"/>
+              <w:right w:type="dxa" w:w="100"/>
+            </w:tcMar>
+          </w:tcPr>
+          <w:p>
+            <w:r>
+              <w:rPr>
+                <w:rFonts w:ascii="Arial" w:cs="Arial" w:eastAsia="Arial" w:hAnsi="Arial"/>
+                <w:b/>
+                <w:bCs/>
+                <w:i w:val="false"/>
+                <w:iCs w:val="false"/>
+                <w:color w:val="FFFFFF"/>
+                <w:sz w:val="20"/>
+                <w:szCs w:val="20"/>
+              </w:rPr>
+              <w:t xml:space="preserve">Values</w:t>
+            </w:r>
+          </w:p>
+        </w:tc>
+        <w:tc>
+          <w:tcPr>
+            <w:tcW w:type="dxa" w:w="1000"/>
+            <w:tcBorders>
+              <w:top w:val="single" w:color="AAAAAA" w:sz="1"/>
+              <w:left w:val="single" w:color="AAAAAA" w:sz="1"/>
+              <w:bottom w:val="single" w:color="AAAAAA" w:sz="1"/>
+              <w:right w:val="single" w:color="AAAAAA" w:sz="1"/>
+            </w:tcBorders>
+            <w:shd w:fill="1F3864" w:val="clear"/>
+            <w:tcMar>
+              <w:top w:type="dxa" w:w="60"/>
+              <w:left w:type="dxa" w:w="100"/>
+              <w:bottom w:type="dxa" w:w="60"/>
+              <w:right w:type="dxa" w:w="100"/>
+            </w:tcMar>
+          </w:tcPr>
+          <w:p>
+            <w:r>
+              <w:rPr>
+                <w:rFonts w:ascii="Arial" w:cs="Arial" w:eastAsia="Arial" w:hAnsi="Arial"/>
+                <w:b/>
+                <w:bCs/>
+                <w:i w:val="false"/>
+                <w:iCs w:val="false"/>
+                <w:color w:val="FFFFFF"/>
+                <w:sz w:val="20"/>
+                <w:szCs w:val="20"/>
+              </w:rPr>
+              <w:t xml:space="preserve">Default</w:t>
+            </w:r>
+          </w:p>
+        </w:tc>
+        <w:tc>
+          <w:tcPr>
+            <w:tcW w:type="dxa" w:w="1860"/>
+            <w:tcBorders>
+              <w:top w:val="single" w:color="AAAAAA" w:sz="1"/>
+              <w:left w:val="single" w:color="AAAAAA" w:sz="1"/>
+              <w:bottom w:val="single" w:color="AAAAAA" w:sz="1"/>
+              <w:right w:val="single" w:color="AAAAAA" w:sz="1"/>
+            </w:tcBorders>
+            <w:shd w:fill="1F3864" w:val="clear"/>
+            <w:tcMar>
+              <w:top w:type="dxa" w:w="60"/>
+              <w:left w:type="dxa" w:w="100"/>
+              <w:bottom w:type="dxa" w:w="60"/>
+              <w:right w:type="dxa" w:w="100"/>
+            </w:tcMar>
+          </w:tcPr>
+          <w:p>
+            <w:r>
+              <w:rPr>
+                <w:rFonts w:ascii="Arial" w:cs="Arial" w:eastAsia="Arial" w:hAnsi="Arial"/>
+                <w:b/>
+                <w:bCs/>
+                <w:i w:val="false"/>
+                <w:iCs w:val="false"/>
+                <w:color w:val="FFFFFF"/>
+                <w:sz w:val="20"/>
+                <w:szCs w:val="20"/>
+              </w:rPr>
+              <w:t xml:space="preserve">ID</w:t>
+            </w:r>
+          </w:p>
+        </w:tc>
+      </w:tr>
+      <w:tr>
+        <w:tc>
+          <w:tcPr>
+            <w:tcW w:type="dxa" w:w="2200"/>
+            <w:tcBorders>
+              <w:top w:val="single" w:color="AAAAAA" w:sz="1"/>
+              <w:left w:val="single" w:color="AAAAAA" w:sz="1"/>
+              <w:bottom w:val="single" w:color="AAAAAA" w:sz="1"/>
+              <w:right w:val="single" w:color="AAAAAA" w:sz="1"/>
+            </w:tcBorders>
+            <w:tcMar>
+              <w:top w:type="dxa" w:w="60"/>
+              <w:left w:type="dxa" w:w="100"/>
+              <w:bottom w:type="dxa" w:w="60"/>
+              <w:right w:type="dxa" w:w="100"/>
+            </w:tcMar>
+          </w:tcPr>
+          <w:p>
+            <w:r>
+              <w:rPr>
+                <w:rFonts w:ascii="Arial" w:cs="Arial" w:eastAsia="Arial" w:hAnsi="Arial"/>
+                <w:b/>
+                <w:bCs/>
+                <w:i w:val="false"/>
+                <w:iCs w:val="false"/>
+                <w:sz w:val="20"/>
+                <w:szCs w:val="20"/>
+              </w:rPr>
+              <w:t xml:space="preserve">applicationDeclineReason</w:t>
+            </w:r>
+          </w:p>
+        </w:tc>
+        <w:tc>
+          <w:tcPr>
+            <w:tcW w:type="dxa" w:w="1100"/>
+            <w:tcBorders>
+              <w:top w:val="single" w:color="AAAAAA" w:sz="1"/>
+              <w:left w:val="single" w:color="AAAAAA" w:sz="1"/>
+              <w:bottom w:val="single" w:color="AAAAAA" w:sz="1"/>
+              <w:right w:val="single" w:color="AAAAAA" w:sz="1"/>
+            </w:tcBorders>
+            <w:tcMar>
+              <w:top w:type="dxa" w:w="60"/>
+              <w:left w:type="dxa" w:w="100"/>
+              <w:bottom w:type="dxa" w:w="60"/>
+              <w:right w:type="dxa" w:w="100"/>
+            </w:tcMar>
+          </w:tcPr>
+          <w:p>
+            <w:r>
+              <w:rPr>
+                <w:rFonts w:ascii="Arial" w:cs="Arial" w:eastAsia="Arial" w:hAnsi="Arial"/>
+                <w:b w:val="false"/>
+                <w:bCs w:val="false"/>
+                <w:i w:val="false"/>
+                <w:iCs w:val="false"/>
+                <w:sz w:val="20"/>
+                <w:szCs w:val="20"/>
+              </w:rPr>
+              <w:t xml:space="preserve">enum</w:t>
+            </w:r>
+          </w:p>
+        </w:tc>
+        <w:tc>
+          <w:tcPr>
+            <w:tcW w:type="dxa" w:w="800"/>
+            <w:tcBorders>
+              <w:top w:val="single" w:color="AAAAAA" w:sz="1"/>
+              <w:left w:val="single" w:color="AAAAAA" w:sz="1"/>
+              <w:bottom w:val="single" w:color="AAAAAA" w:sz="1"/>
+              <w:right w:val="single" w:color="AAAAAA" w:sz="1"/>
+            </w:tcBorders>
+            <w:tcMar>
+              <w:top w:type="dxa" w:w="60"/>
+              <w:left w:type="dxa" w:w="100"/>
+              <w:bottom w:type="dxa" w:w="60"/>
+              <w:right w:type="dxa" w:w="100"/>
+            </w:tcMar>
+          </w:tcPr>
+          <w:p>
+            <w:r>
+              <w:rPr>
+                <w:rFonts w:ascii="Arial" w:cs="Arial" w:eastAsia="Arial" w:hAnsi="Arial"/>
+                <w:b w:val="false"/>
+                <w:bCs w:val="false"/>
+                <w:i w:val="false"/>
+                <w:iCs w:val="false"/>
+                <w:sz w:val="20"/>
+                <w:szCs w:val="20"/>
+              </w:rPr>
+              <w:t xml:space="preserve">Conditional</w:t>
+            </w:r>
+          </w:p>
+        </w:tc>
+        <w:tc>
+          <w:tcPr>
+            <w:tcW w:type="dxa" w:w="2400"/>
+            <w:tcBorders>
+              <w:top w:val="single" w:color="AAAAAA" w:sz="1"/>
+              <w:left w:val="single" w:color="AAAAAA" w:sz="1"/>
+              <w:bottom w:val="single" w:color="AAAAAA" w:sz="1"/>
+              <w:right w:val="single" w:color="AAAAAA" w:sz="1"/>
+            </w:tcBorders>
+            <w:tcMar>
+              <w:top w:type="dxa" w:w="60"/>
+              <w:left w:type="dxa" w:w="100"/>
+              <w:bottom w:type="dxa" w:w="60"/>
+              <w:right w:type="dxa" w:w="100"/>
+            </w:tcMar>
+          </w:tcPr>
+          <w:p>
+            <w:r>
+              <w:rPr>
+                <w:rFonts w:ascii="Arial" w:cs="Arial" w:eastAsia="Arial" w:hAnsi="Arial"/>
+                <w:b w:val="false"/>
+                <w:bCs w:val="false"/>
+                <w:i w:val="false"/>
+                <w:iCs w:val="false"/>
+                <w:sz w:val="20"/>
+                <w:szCs w:val="20"/>
+              </w:rPr>
+              <w:t xml:space="preserve">Insufficient Experience, Incomplete Application, Failed Background Check, Conflict of Interest, Unresponsive, Candidate Withdrew, Other</w:t>
+            </w:r>
+          </w:p>
+        </w:tc>
+        <w:tc>
+          <w:tcPr>
+            <w:tcW w:type="dxa" w:w="1000"/>
+            <w:tcBorders>
+              <w:top w:val="single" w:color="AAAAAA" w:sz="1"/>
+              <w:left w:val="single" w:color="AAAAAA" w:sz="1"/>
+              <w:bottom w:val="single" w:color="AAAAAA" w:sz="1"/>
+              <w:right w:val="single" w:color="AAAAAA" w:sz="1"/>
+            </w:tcBorders>
+            <w:tcMar>
+              <w:top w:type="dxa" w:w="60"/>
+              <w:left w:type="dxa" w:w="100"/>
+              <w:bottom w:type="dxa" w:w="60"/>
+              <w:right w:type="dxa" w:w="100"/>
+            </w:tcMar>
+          </w:tcPr>
+          <w:p>
+            <w:r>
+              <w:rPr>
+                <w:rFonts w:ascii="Arial" w:cs="Arial" w:eastAsia="Arial" w:hAnsi="Arial"/>
+                <w:b w:val="false"/>
+                <w:bCs w:val="false"/>
+                <w:i w:val="false"/>
+                <w:iCs w:val="false"/>
+                <w:sz w:val="20"/>
+                <w:szCs w:val="20"/>
+              </w:rPr>
+              <w:t xml:space="preserve">—</w:t>
+            </w:r>
+          </w:p>
+        </w:tc>
+        <w:tc>
+          <w:tcPr>
+            <w:tcW w:type="dxa" w:w="1860"/>
+            <w:tcBorders>
+              <w:top w:val="single" w:color="AAAAAA" w:sz="1"/>
+              <w:left w:val="single" w:color="AAAAAA" w:sz="1"/>
+              <w:bottom w:val="single" w:color="AAAAAA" w:sz="1"/>
+              <w:right w:val="single" w:color="AAAAAA" w:sz="1"/>
+            </w:tcBorders>
+            <w:tcMar>
+              <w:top w:type="dxa" w:w="60"/>
+              <w:left w:type="dxa" w:w="100"/>
+              <w:bottom w:type="dxa" w:w="60"/>
+              <w:right w:type="dxa" w:w="100"/>
+            </w:tcMar>
+          </w:tcPr>
+          <w:p>
+            <w:r>
+              <w:rPr>
+                <w:rFonts w:ascii="Arial" w:cs="Arial" w:eastAsia="Arial" w:hAnsi="Arial"/>
+                <w:b w:val="false"/>
+                <w:bCs w:val="false"/>
+                <w:i w:val="false"/>
+                <w:iCs w:val="false"/>
+                <w:color w:val="888888"/>
+                <w:sz w:val="16"/>
+                <w:szCs w:val="16"/>
+              </w:rPr>
+              <w:t xml:space="preserve">MR-APPLY-DAT-024</w:t>
+            </w:r>
+          </w:p>
+        </w:tc>
+      </w:tr>
+      <w:tr>
+        <w:tc>
+          <w:tcPr>
+            <w:tcW w:type="dxa" w:w="9360"/>
+            <w:gridSpan w:val="6"/>
+            <w:tcBorders>
+              <w:top w:val="single" w:color="AAAAAA" w:sz="1"/>
+              <w:left w:val="single" w:color="AAAAAA" w:sz="1"/>
+              <w:bottom w:val="single" w:color="AAAAAA" w:sz="1"/>
+              <w:right w:val="single" w:color="AAAAAA" w:sz="1"/>
+            </w:tcBorders>
+            <w:tcMar>
+              <w:top w:type="dxa" w:w="40"/>
+              <w:left w:type="dxa" w:w="100"/>
+              <w:bottom w:type="dxa" w:w="80"/>
+              <w:right w:type="dxa" w:w="100"/>
+            </w:tcMar>
+          </w:tcPr>
+          <w:p>
+            <w:r>
+              <w:rPr>
+                <w:rFonts w:ascii="Arial" w:cs="Arial" w:eastAsia="Arial" w:hAnsi="Arial"/>
+                <w:b w:val="false"/>
+                <w:bCs w:val="false"/>
+                <w:i w:val="false"/>
+                <w:iCs w:val="false"/>
+                <w:color w:val="888888"/>
+                <w:sz w:val="20"/>
+                <w:szCs w:val="20"/>
+              </w:rPr>
+              <w:t xml:space="preserve">Reason the mentor application was declined. Required when mentorStatus = Declined. Admin-only. Dynamic logic: visible only when mentorStatus = Declined. Used during both MR-APPLY (application decline) and MR-ONBOARD (onboarding decline). Reconciled to 7 values (MR-RECON-DEC-002): Unresponsive and Candidate Withdrew added by MR-ONBOARD. </w:t>
+            </w:r>
+            <w:r>
+              <w:rPr>
+                <w:rFonts w:ascii="Arial" w:cs="Arial" w:eastAsia="Arial" w:hAnsi="Arial"/>
+                <w:b/>
+                <w:bCs/>
+                <w:i w:val="false"/>
+                <w:iCs w:val="false"/>
+                <w:color w:val="888888"/>
+                <w:sz w:val="20"/>
+                <w:szCs w:val="20"/>
+              </w:rPr>
+              <w:t xml:space="preserve">Domains: </w:t>
+            </w:r>
+            <w:r>
+              <w:rPr>
+                <w:rFonts w:ascii="Arial" w:cs="Arial" w:eastAsia="Arial" w:hAnsi="Arial"/>
+                <w:b w:val="false"/>
+                <w:bCs w:val="false"/>
+                <w:i w:val="false"/>
+                <w:iCs w:val="false"/>
+                <w:color w:val="888888"/>
+                <w:sz w:val="20"/>
+                <w:szCs w:val="20"/>
+              </w:rPr>
+              <w:t xml:space="preserve">MR. </w:t>
+            </w:r>
+            <w:r>
+              <w:rPr>
+                <w:rFonts w:ascii="Arial" w:cs="Arial" w:eastAsia="Arial" w:hAnsi="Arial"/>
+                <w:b/>
+                <w:bCs/>
+                <w:i w:val="false"/>
+                <w:iCs w:val="false"/>
+                <w:color w:val="888888"/>
+                <w:sz w:val="20"/>
+                <w:szCs w:val="20"/>
+              </w:rPr>
+              <w:t xml:space="preserve">Implementation: </w:t>
+            </w:r>
+            <w:r>
+              <w:rPr>
+                <w:rFonts w:ascii="Arial" w:cs="Arial" w:eastAsia="Arial" w:hAnsi="Arial"/>
+                <w:b w:val="false"/>
+                <w:bCs w:val="false"/>
+                <w:i w:val="false"/>
+                <w:iCs w:val="false"/>
+                <w:color w:val="888888"/>
+                <w:sz w:val="20"/>
+                <w:szCs w:val="20"/>
+              </w:rPr>
+              <w:t xml:space="preserve">admin-only. Dynamic logic: visible when mentorStatus = Declined.</w:t>
+            </w:r>
+          </w:p>
+        </w:tc>
+      </w:tr>
+    </w:tbl>
+    <w:p>
+      <w:pPr>
+        <w:spacing w:after="120"/>
+      </w:pPr>
+      <w:r>
+        <w:rPr>
+          <w:rFonts w:ascii="Arial" w:cs="Arial" w:eastAsia="Arial" w:hAnsi="Arial"/>
+          <w:b/>
+          <w:bCs/>
+          <w:i w:val="false"/>
+          <w:iCs w:val="false"/>
+          <w:color w:val="1F3864"/>
+          <w:sz w:val="22"/>
+          <w:szCs w:val="22"/>
+        </w:rPr>
+        <w:t xml:space="preserve">Analytics</w:t>
+      </w:r>
+    </w:p>
+    <w:tbl>
+      <w:tblPr>
+        <w:tblW w:type="dxa" w:w="9360"/>
+        <w:tblBorders>
+          <w:top w:val="single" w:color="auto" w:sz="4"/>
+          <w:left w:val="single" w:color="auto" w:sz="4"/>
+          <w:bottom w:val="single" w:color="auto" w:sz="4"/>
+          <w:right w:val="single" w:color="auto" w:sz="4"/>
+          <w:insideH w:val="single" w:color="auto" w:sz="4"/>
+          <w:insideV w:val="single" w:color="auto" w:sz="4"/>
+        </w:tblBorders>
+      </w:tblPr>
+      <w:tblGrid>
+        <w:gridCol w:w="2200"/>
+        <w:gridCol w:w="1100"/>
+        <w:gridCol w:w="800"/>
+        <w:gridCol w:w="2400"/>
+        <w:gridCol w:w="1000"/>
+        <w:gridCol w:w="1860"/>
+      </w:tblGrid>
+      <w:tr>
+        <w:tc>
+          <w:tcPr>
+            <w:tcW w:type="dxa" w:w="2200"/>
+            <w:tcBorders>
+              <w:top w:val="single" w:color="AAAAAA" w:sz="1"/>
+              <w:left w:val="single" w:color="AAAAAA" w:sz="1"/>
+              <w:bottom w:val="single" w:color="AAAAAA" w:sz="1"/>
+              <w:right w:val="single" w:color="AAAAAA" w:sz="1"/>
+            </w:tcBorders>
+            <w:shd w:fill="1F3864" w:val="clear"/>
+            <w:tcMar>
+              <w:top w:type="dxa" w:w="60"/>
+              <w:left w:type="dxa" w:w="100"/>
+              <w:bottom w:type="dxa" w:w="60"/>
+              <w:right w:type="dxa" w:w="100"/>
+            </w:tcMar>
+          </w:tcPr>
+          <w:p>
+            <w:r>
+              <w:rPr>
+                <w:rFonts w:ascii="Arial" w:cs="Arial" w:eastAsia="Arial" w:hAnsi="Arial"/>
+                <w:b/>
+                <w:bCs/>
+                <w:i w:val="false"/>
+                <w:iCs w:val="false"/>
+                <w:color w:val="FFFFFF"/>
+                <w:sz w:val="20"/>
+                <w:szCs w:val="20"/>
+              </w:rPr>
+              <w:t xml:space="preserve">Field Name</w:t>
+            </w:r>
+          </w:p>
+        </w:tc>
+        <w:tc>
+          <w:tcPr>
+            <w:tcW w:type="dxa" w:w="1100"/>
+            <w:tcBorders>
+              <w:top w:val="single" w:color="AAAAAA" w:sz="1"/>
+              <w:left w:val="single" w:color="AAAAAA" w:sz="1"/>
+              <w:bottom w:val="single" w:color="AAAAAA" w:sz="1"/>
+              <w:right w:val="single" w:color="AAAAAA" w:sz="1"/>
+            </w:tcBorders>
+            <w:shd w:fill="1F3864" w:val="clear"/>
+            <w:tcMar>
+              <w:top w:type="dxa" w:w="60"/>
+              <w:left w:type="dxa" w:w="100"/>
+              <w:bottom w:type="dxa" w:w="60"/>
+              <w:right w:type="dxa" w:w="100"/>
+            </w:tcMar>
+          </w:tcPr>
+          <w:p>
+            <w:r>
+              <w:rPr>
+                <w:rFonts w:ascii="Arial" w:cs="Arial" w:eastAsia="Arial" w:hAnsi="Arial"/>
+                <w:b/>
+                <w:bCs/>
+                <w:i w:val="false"/>
+                <w:iCs w:val="false"/>
+                <w:color w:val="FFFFFF"/>
+                <w:sz w:val="20"/>
+                <w:szCs w:val="20"/>
+              </w:rPr>
+              <w:t xml:space="preserve">Type</w:t>
+            </w:r>
+          </w:p>
+        </w:tc>
+        <w:tc>
+          <w:tcPr>
+            <w:tcW w:type="dxa" w:w="800"/>
+            <w:tcBorders>
+              <w:top w:val="single" w:color="AAAAAA" w:sz="1"/>
+              <w:left w:val="single" w:color="AAAAAA" w:sz="1"/>
+              <w:bottom w:val="single" w:color="AAAAAA" w:sz="1"/>
+              <w:right w:val="single" w:color="AAAAAA" w:sz="1"/>
+            </w:tcBorders>
+            <w:shd w:fill="1F3864" w:val="clear"/>
+            <w:tcMar>
+              <w:top w:type="dxa" w:w="60"/>
+              <w:left w:type="dxa" w:w="100"/>
+              <w:bottom w:type="dxa" w:w="60"/>
+              <w:right w:type="dxa" w:w="100"/>
+            </w:tcMar>
+          </w:tcPr>
+          <w:p>
+            <w:r>
+              <w:rPr>
+                <w:rFonts w:ascii="Arial" w:cs="Arial" w:eastAsia="Arial" w:hAnsi="Arial"/>
+                <w:b/>
+                <w:bCs/>
+                <w:i w:val="false"/>
+                <w:iCs w:val="false"/>
+                <w:color w:val="FFFFFF"/>
+                <w:sz w:val="20"/>
+                <w:szCs w:val="20"/>
+              </w:rPr>
+              <w:t xml:space="preserve">Required</w:t>
+            </w:r>
+          </w:p>
+        </w:tc>
+        <w:tc>
+          <w:tcPr>
+            <w:tcW w:type="dxa" w:w="2400"/>
+            <w:tcBorders>
+              <w:top w:val="single" w:color="AAAAAA" w:sz="1"/>
+              <w:left w:val="single" w:color="AAAAAA" w:sz="1"/>
+              <w:bottom w:val="single" w:color="AAAAAA" w:sz="1"/>
+              <w:right w:val="single" w:color="AAAAAA" w:sz="1"/>
+            </w:tcBorders>
+            <w:shd w:fill="1F3864" w:val="clear"/>
+            <w:tcMar>
+              <w:top w:type="dxa" w:w="60"/>
+              <w:left w:type="dxa" w:w="100"/>
+              <w:bottom w:type="dxa" w:w="60"/>
+              <w:right w:type="dxa" w:w="100"/>
+            </w:tcMar>
+          </w:tcPr>
+          <w:p>
+            <w:r>
+              <w:rPr>
+                <w:rFonts w:ascii="Arial" w:cs="Arial" w:eastAsia="Arial" w:hAnsi="Arial"/>
+                <w:b/>
+                <w:bCs/>
+                <w:i w:val="false"/>
+                <w:iCs w:val="false"/>
+                <w:color w:val="FFFFFF"/>
+                <w:sz w:val="20"/>
+                <w:szCs w:val="20"/>
+              </w:rPr>
+              <w:t xml:space="preserve">Values</w:t>
+            </w:r>
+          </w:p>
+        </w:tc>
+        <w:tc>
+          <w:tcPr>
+            <w:tcW w:type="dxa" w:w="1000"/>
+            <w:tcBorders>
+              <w:top w:val="single" w:color="AAAAAA" w:sz="1"/>
+              <w:left w:val="single" w:color="AAAAAA" w:sz="1"/>
+              <w:bottom w:val="single" w:color="AAAAAA" w:sz="1"/>
+              <w:right w:val="single" w:color="AAAAAA" w:sz="1"/>
+            </w:tcBorders>
+            <w:shd w:fill="1F3864" w:val="clear"/>
+            <w:tcMar>
+              <w:top w:type="dxa" w:w="60"/>
+              <w:left w:type="dxa" w:w="100"/>
+              <w:bottom w:type="dxa" w:w="60"/>
+              <w:right w:type="dxa" w:w="100"/>
+            </w:tcMar>
+          </w:tcPr>
+          <w:p>
+            <w:r>
+              <w:rPr>
+                <w:rFonts w:ascii="Arial" w:cs="Arial" w:eastAsia="Arial" w:hAnsi="Arial"/>
+                <w:b/>
+                <w:bCs/>
+                <w:i w:val="false"/>
+                <w:iCs w:val="false"/>
+                <w:color w:val="FFFFFF"/>
+                <w:sz w:val="20"/>
+                <w:szCs w:val="20"/>
+              </w:rPr>
+              <w:t xml:space="preserve">Default</w:t>
+            </w:r>
+          </w:p>
+        </w:tc>
+        <w:tc>
+          <w:tcPr>
+            <w:tcW w:type="dxa" w:w="1860"/>
+            <w:tcBorders>
+              <w:top w:val="single" w:color="AAAAAA" w:sz="1"/>
+              <w:left w:val="single" w:color="AAAAAA" w:sz="1"/>
+              <w:bottom w:val="single" w:color="AAAAAA" w:sz="1"/>
+              <w:right w:val="single" w:color="AAAAAA" w:sz="1"/>
+            </w:tcBorders>
+            <w:shd w:fill="1F3864" w:val="clear"/>
+            <w:tcMar>
+              <w:top w:type="dxa" w:w="60"/>
+              <w:left w:type="dxa" w:w="100"/>
+              <w:bottom w:type="dxa" w:w="60"/>
+              <w:right w:type="dxa" w:w="100"/>
+            </w:tcMar>
+          </w:tcPr>
+          <w:p>
+            <w:r>
+              <w:rPr>
+                <w:rFonts w:ascii="Arial" w:cs="Arial" w:eastAsia="Arial" w:hAnsi="Arial"/>
+                <w:b/>
+                <w:bCs/>
+                <w:i w:val="false"/>
+                <w:iCs w:val="false"/>
+                <w:color w:val="FFFFFF"/>
+                <w:sz w:val="20"/>
+                <w:szCs w:val="20"/>
+              </w:rPr>
+              <w:t xml:space="preserve">ID</w:t>
+            </w:r>
+          </w:p>
+        </w:tc>
+      </w:tr>
+      <w:tr>
+        <w:tc>
+          <w:tcPr>
+            <w:tcW w:type="dxa" w:w="2200"/>
+            <w:tcBorders>
+              <w:top w:val="single" w:color="AAAAAA" w:sz="1"/>
+              <w:left w:val="single" w:color="AAAAAA" w:sz="1"/>
+              <w:bottom w:val="single" w:color="AAAAAA" w:sz="1"/>
+              <w:right w:val="single" w:color="AAAAAA" w:sz="1"/>
+            </w:tcBorders>
+            <w:tcMar>
+              <w:top w:type="dxa" w:w="60"/>
+              <w:left w:type="dxa" w:w="100"/>
+              <w:bottom w:type="dxa" w:w="60"/>
+              <w:right w:type="dxa" w:w="100"/>
+            </w:tcMar>
+          </w:tcPr>
+          <w:p>
+            <w:r>
+              <w:rPr>
+                <w:rFonts w:ascii="Arial" w:cs="Arial" w:eastAsia="Arial" w:hAnsi="Arial"/>
+                <w:b/>
+                <w:bCs/>
+                <w:i w:val="false"/>
+                <w:iCs w:val="false"/>
+                <w:sz w:val="20"/>
+                <w:szCs w:val="20"/>
+              </w:rPr>
+              <w:t xml:space="preserve">totalLifetimeSessions</w:t>
+            </w:r>
+          </w:p>
+        </w:tc>
+        <w:tc>
+          <w:tcPr>
+            <w:tcW w:type="dxa" w:w="1100"/>
+            <w:tcBorders>
+              <w:top w:val="single" w:color="AAAAAA" w:sz="1"/>
+              <w:left w:val="single" w:color="AAAAAA" w:sz="1"/>
+              <w:bottom w:val="single" w:color="AAAAAA" w:sz="1"/>
+              <w:right w:val="single" w:color="AAAAAA" w:sz="1"/>
+            </w:tcBorders>
+            <w:tcMar>
+              <w:top w:type="dxa" w:w="60"/>
+              <w:left w:type="dxa" w:w="100"/>
+              <w:bottom w:type="dxa" w:w="60"/>
+              <w:right w:type="dxa" w:w="100"/>
+            </w:tcMar>
+          </w:tcPr>
+          <w:p>
+            <w:r>
+              <w:rPr>
+                <w:rFonts w:ascii="Arial" w:cs="Arial" w:eastAsia="Arial" w:hAnsi="Arial"/>
+                <w:b w:val="false"/>
+                <w:bCs w:val="false"/>
+                <w:i w:val="false"/>
+                <w:iCs w:val="false"/>
+                <w:sz w:val="20"/>
+                <w:szCs w:val="20"/>
+              </w:rPr>
+              <w:t xml:space="preserve">int</w:t>
+            </w:r>
+          </w:p>
+        </w:tc>
+        <w:tc>
+          <w:tcPr>
+            <w:tcW w:type="dxa" w:w="800"/>
+            <w:tcBorders>
+              <w:top w:val="single" w:color="AAAAAA" w:sz="1"/>
+              <w:left w:val="single" w:color="AAAAAA" w:sz="1"/>
+              <w:bottom w:val="single" w:color="AAAAAA" w:sz="1"/>
+              <w:right w:val="single" w:color="AAAAAA" w:sz="1"/>
+            </w:tcBorders>
+            <w:tcMar>
+              <w:top w:type="dxa" w:w="60"/>
+              <w:left w:type="dxa" w:w="100"/>
+              <w:bottom w:type="dxa" w:w="60"/>
+              <w:right w:type="dxa" w:w="100"/>
+            </w:tcMar>
+          </w:tcPr>
+          <w:p>
+            <w:r>
+              <w:rPr>
+                <w:rFonts w:ascii="Arial" w:cs="Arial" w:eastAsia="Arial" w:hAnsi="Arial"/>
+                <w:b w:val="false"/>
+                <w:bCs w:val="false"/>
+                <w:i w:val="false"/>
+                <w:iCs w:val="false"/>
+                <w:sz w:val="20"/>
+                <w:szCs w:val="20"/>
+              </w:rPr>
+              <w:t xml:space="preserve">System</w:t>
+            </w:r>
+          </w:p>
+        </w:tc>
+        <w:tc>
+          <w:tcPr>
+            <w:tcW w:type="dxa" w:w="2400"/>
+            <w:tcBorders>
+              <w:top w:val="single" w:color="AAAAAA" w:sz="1"/>
+              <w:left w:val="single" w:color="AAAAAA" w:sz="1"/>
+              <w:bottom w:val="single" w:color="AAAAAA" w:sz="1"/>
+              <w:right w:val="single" w:color="AAAAAA" w:sz="1"/>
+            </w:tcBorders>
+            <w:tcMar>
+              <w:top w:type="dxa" w:w="60"/>
+              <w:left w:type="dxa" w:w="100"/>
+              <w:bottom w:type="dxa" w:w="60"/>
+              <w:right w:type="dxa" w:w="100"/>
+            </w:tcMar>
+          </w:tcPr>
+          <w:p>
+            <w:r>
+              <w:rPr>
+                <w:rFonts w:ascii="Arial" w:cs="Arial" w:eastAsia="Arial" w:hAnsi="Arial"/>
+                <w:b w:val="false"/>
+                <w:bCs w:val="false"/>
+                <w:i w:val="false"/>
+                <w:iCs w:val="false"/>
+                <w:sz w:val="20"/>
+                <w:szCs w:val="20"/>
+              </w:rPr>
+              <w:t xml:space="preserve">—</w:t>
+            </w:r>
+          </w:p>
+        </w:tc>
+        <w:tc>
+          <w:tcPr>
+            <w:tcW w:type="dxa" w:w="1000"/>
+            <w:tcBorders>
+              <w:top w:val="single" w:color="AAAAAA" w:sz="1"/>
+              <w:left w:val="single" w:color="AAAAAA" w:sz="1"/>
+              <w:bottom w:val="single" w:color="AAAAAA" w:sz="1"/>
+              <w:right w:val="single" w:color="AAAAAA" w:sz="1"/>
+            </w:tcBorders>
+            <w:tcMar>
+              <w:top w:type="dxa" w:w="60"/>
+              <w:left w:type="dxa" w:w="100"/>
+              <w:bottom w:type="dxa" w:w="60"/>
+              <w:right w:type="dxa" w:w="100"/>
+            </w:tcMar>
+          </w:tcPr>
+          <w:p>
+            <w:r>
+              <w:rPr>
+                <w:rFonts w:ascii="Arial" w:cs="Arial" w:eastAsia="Arial" w:hAnsi="Arial"/>
+                <w:b w:val="false"/>
+                <w:bCs w:val="false"/>
+                <w:i w:val="false"/>
+                <w:iCs w:val="false"/>
+                <w:sz w:val="20"/>
+                <w:szCs w:val="20"/>
+              </w:rPr>
+              <w:t xml:space="preserve">—</w:t>
+            </w:r>
+          </w:p>
+        </w:tc>
+        <w:tc>
+          <w:tcPr>
+            <w:tcW w:type="dxa" w:w="1860"/>
+            <w:tcBorders>
+              <w:top w:val="single" w:color="AAAAAA" w:sz="1"/>
+              <w:left w:val="single" w:color="AAAAAA" w:sz="1"/>
+              <w:bottom w:val="single" w:color="AAAAAA" w:sz="1"/>
+              <w:right w:val="single" w:color="AAAAAA" w:sz="1"/>
+            </w:tcBorders>
+            <w:tcMar>
+              <w:top w:type="dxa" w:w="60"/>
+              <w:left w:type="dxa" w:w="100"/>
+              <w:bottom w:type="dxa" w:w="60"/>
+              <w:right w:type="dxa" w:w="100"/>
+            </w:tcMar>
+          </w:tcPr>
+          <w:p>
+            <w:r>
+              <w:rPr>
+                <w:rFonts w:ascii="Arial" w:cs="Arial" w:eastAsia="Arial" w:hAnsi="Arial"/>
+                <w:b w:val="false"/>
+                <w:bCs w:val="false"/>
+                <w:i w:val="false"/>
+                <w:iCs w:val="false"/>
+                <w:color w:val="888888"/>
+                <w:sz w:val="16"/>
+                <w:szCs w:val="16"/>
+              </w:rPr>
+              <w:t xml:space="preserve">MR-MANAGE-DAT-021</w:t>
+            </w:r>
+          </w:p>
+        </w:tc>
+      </w:tr>
+      <w:tr>
+        <w:tc>
+          <w:tcPr>
+            <w:tcW w:type="dxa" w:w="9360"/>
+            <w:gridSpan w:val="6"/>
+            <w:tcBorders>
+              <w:top w:val="single" w:color="AAAAAA" w:sz="1"/>
+              <w:left w:val="single" w:color="AAAAAA" w:sz="1"/>
+              <w:bottom w:val="single" w:color="AAAAAA" w:sz="1"/>
+              <w:right w:val="single" w:color="AAAAAA" w:sz="1"/>
+            </w:tcBorders>
+            <w:tcMar>
+              <w:top w:type="dxa" w:w="40"/>
+              <w:left w:type="dxa" w:w="100"/>
+              <w:bottom w:type="dxa" w:w="80"/>
+              <w:right w:type="dxa" w:w="100"/>
+            </w:tcMar>
+          </w:tcPr>
+          <w:p>
+            <w:r>
+              <w:rPr>
+                <w:rFonts w:ascii="Arial" w:cs="Arial" w:eastAsia="Arial" w:hAnsi="Arial"/>
+                <w:b w:val="false"/>
+                <w:bCs w:val="false"/>
+                <w:i w:val="false"/>
+                <w:iCs w:val="false"/>
+                <w:color w:val="888888"/>
+                <w:sz w:val="20"/>
+                <w:szCs w:val="20"/>
+              </w:rPr>
+              <w:t xml:space="preserve">Count of all completed sessions across all of the mentor’s engagements. System-calculated, read-only. Visible in list views and detail pages. </w:t>
+            </w:r>
+            <w:r>
+              <w:rPr>
+                <w:rFonts w:ascii="Arial" w:cs="Arial" w:eastAsia="Arial" w:hAnsi="Arial"/>
+                <w:b/>
+                <w:bCs/>
+                <w:i w:val="false"/>
+                <w:iCs w:val="false"/>
+                <w:color w:val="888888"/>
+                <w:sz w:val="20"/>
+                <w:szCs w:val="20"/>
+              </w:rPr>
+              <w:t xml:space="preserve">Domains: </w:t>
+            </w:r>
+            <w:r>
+              <w:rPr>
+                <w:rFonts w:ascii="Arial" w:cs="Arial" w:eastAsia="Arial" w:hAnsi="Arial"/>
+                <w:b w:val="false"/>
+                <w:bCs w:val="false"/>
+                <w:i w:val="false"/>
+                <w:iCs w:val="false"/>
+                <w:color w:val="888888"/>
+                <w:sz w:val="20"/>
+                <w:szCs w:val="20"/>
+              </w:rPr>
+              <w:t xml:space="preserve">MR. </w:t>
+            </w:r>
+            <w:r>
+              <w:rPr>
+                <w:rFonts w:ascii="Arial" w:cs="Arial" w:eastAsia="Arial" w:hAnsi="Arial"/>
+                <w:b/>
+                <w:bCs/>
+                <w:i w:val="false"/>
+                <w:iCs w:val="false"/>
+                <w:color w:val="888888"/>
+                <w:sz w:val="20"/>
+                <w:szCs w:val="20"/>
+              </w:rPr>
+              <w:t xml:space="preserve">Implementation: </w:t>
+            </w:r>
+            <w:r>
+              <w:rPr>
+                <w:rFonts w:ascii="Arial" w:cs="Arial" w:eastAsia="Arial" w:hAnsi="Arial"/>
+                <w:b w:val="false"/>
+                <w:bCs w:val="false"/>
+                <w:i w:val="false"/>
+                <w:iCs w:val="false"/>
+                <w:color w:val="888888"/>
+                <w:sz w:val="20"/>
+                <w:szCs w:val="20"/>
+              </w:rPr>
+              <w:t xml:space="preserve">system-calculated, readOnly.</w:t>
+            </w:r>
+          </w:p>
+        </w:tc>
+      </w:tr>
+      <w:tr>
+        <w:tc>
+          <w:tcPr>
+            <w:tcW w:type="dxa" w:w="2200"/>
+            <w:tcBorders>
+              <w:top w:val="single" w:color="AAAAAA" w:sz="1"/>
+              <w:left w:val="single" w:color="AAAAAA" w:sz="1"/>
+              <w:bottom w:val="single" w:color="AAAAAA" w:sz="1"/>
+              <w:right w:val="single" w:color="AAAAAA" w:sz="1"/>
+            </w:tcBorders>
+            <w:tcMar>
+              <w:top w:type="dxa" w:w="60"/>
+              <w:left w:type="dxa" w:w="100"/>
+              <w:bottom w:type="dxa" w:w="60"/>
+              <w:right w:type="dxa" w:w="100"/>
+            </w:tcMar>
+          </w:tcPr>
+          <w:p>
+            <w:r>
+              <w:rPr>
+                <w:rFonts w:ascii="Arial" w:cs="Arial" w:eastAsia="Arial" w:hAnsi="Arial"/>
+                <w:b/>
+                <w:bCs/>
+                <w:i w:val="false"/>
+                <w:iCs w:val="false"/>
+                <w:sz w:val="20"/>
+                <w:szCs w:val="20"/>
+              </w:rPr>
+              <w:t xml:space="preserve">totalMentoringHours</w:t>
+            </w:r>
+          </w:p>
+        </w:tc>
+        <w:tc>
+          <w:tcPr>
+            <w:tcW w:type="dxa" w:w="1100"/>
+            <w:tcBorders>
+              <w:top w:val="single" w:color="AAAAAA" w:sz="1"/>
+              <w:left w:val="single" w:color="AAAAAA" w:sz="1"/>
+              <w:bottom w:val="single" w:color="AAAAAA" w:sz="1"/>
+              <w:right w:val="single" w:color="AAAAAA" w:sz="1"/>
+            </w:tcBorders>
+            <w:tcMar>
+              <w:top w:type="dxa" w:w="60"/>
+              <w:left w:type="dxa" w:w="100"/>
+              <w:bottom w:type="dxa" w:w="60"/>
+              <w:right w:type="dxa" w:w="100"/>
+            </w:tcMar>
+          </w:tcPr>
+          <w:p>
+            <w:r>
+              <w:rPr>
+                <w:rFonts w:ascii="Arial" w:cs="Arial" w:eastAsia="Arial" w:hAnsi="Arial"/>
+                <w:b w:val="false"/>
+                <w:bCs w:val="false"/>
+                <w:i w:val="false"/>
+                <w:iCs w:val="false"/>
+                <w:sz w:val="20"/>
+                <w:szCs w:val="20"/>
+              </w:rPr>
+              <w:t xml:space="preserve">float</w:t>
+            </w:r>
+          </w:p>
+        </w:tc>
+        <w:tc>
+          <w:tcPr>
+            <w:tcW w:type="dxa" w:w="800"/>
+            <w:tcBorders>
+              <w:top w:val="single" w:color="AAAAAA" w:sz="1"/>
+              <w:left w:val="single" w:color="AAAAAA" w:sz="1"/>
+              <w:bottom w:val="single" w:color="AAAAAA" w:sz="1"/>
+              <w:right w:val="single" w:color="AAAAAA" w:sz="1"/>
+            </w:tcBorders>
+            <w:tcMar>
+              <w:top w:type="dxa" w:w="60"/>
+              <w:left w:type="dxa" w:w="100"/>
+              <w:bottom w:type="dxa" w:w="60"/>
+              <w:right w:type="dxa" w:w="100"/>
+            </w:tcMar>
+          </w:tcPr>
+          <w:p>
+            <w:r>
+              <w:rPr>
+                <w:rFonts w:ascii="Arial" w:cs="Arial" w:eastAsia="Arial" w:hAnsi="Arial"/>
+                <w:b w:val="false"/>
+                <w:bCs w:val="false"/>
+                <w:i w:val="false"/>
+                <w:iCs w:val="false"/>
+                <w:sz w:val="20"/>
+                <w:szCs w:val="20"/>
+              </w:rPr>
+              <w:t xml:space="preserve">System</w:t>
+            </w:r>
+          </w:p>
+        </w:tc>
+        <w:tc>
+          <w:tcPr>
+            <w:tcW w:type="dxa" w:w="2400"/>
+            <w:tcBorders>
+              <w:top w:val="single" w:color="AAAAAA" w:sz="1"/>
+              <w:left w:val="single" w:color="AAAAAA" w:sz="1"/>
+              <w:bottom w:val="single" w:color="AAAAAA" w:sz="1"/>
+              <w:right w:val="single" w:color="AAAAAA" w:sz="1"/>
+            </w:tcBorders>
+            <w:tcMar>
+              <w:top w:type="dxa" w:w="60"/>
+              <w:left w:type="dxa" w:w="100"/>
+              <w:bottom w:type="dxa" w:w="60"/>
+              <w:right w:type="dxa" w:w="100"/>
+            </w:tcMar>
+          </w:tcPr>
+          <w:p>
+            <w:r>
+              <w:rPr>
+                <w:rFonts w:ascii="Arial" w:cs="Arial" w:eastAsia="Arial" w:hAnsi="Arial"/>
+                <w:b w:val="false"/>
+                <w:bCs w:val="false"/>
+                <w:i w:val="false"/>
+                <w:iCs w:val="false"/>
+                <w:sz w:val="20"/>
+                <w:szCs w:val="20"/>
+              </w:rPr>
+              <w:t xml:space="preserve">—</w:t>
+            </w:r>
+          </w:p>
+        </w:tc>
+        <w:tc>
+          <w:tcPr>
+            <w:tcW w:type="dxa" w:w="1000"/>
+            <w:tcBorders>
+              <w:top w:val="single" w:color="AAAAAA" w:sz="1"/>
+              <w:left w:val="single" w:color="AAAAAA" w:sz="1"/>
+              <w:bottom w:val="single" w:color="AAAAAA" w:sz="1"/>
+              <w:right w:val="single" w:color="AAAAAA" w:sz="1"/>
+            </w:tcBorders>
+            <w:tcMar>
+              <w:top w:type="dxa" w:w="60"/>
+              <w:left w:type="dxa" w:w="100"/>
+              <w:bottom w:type="dxa" w:w="60"/>
+              <w:right w:type="dxa" w:w="100"/>
+            </w:tcMar>
+          </w:tcPr>
+          <w:p>
+            <w:r>
+              <w:rPr>
+                <w:rFonts w:ascii="Arial" w:cs="Arial" w:eastAsia="Arial" w:hAnsi="Arial"/>
+                <w:b w:val="false"/>
+                <w:bCs w:val="false"/>
+                <w:i w:val="false"/>
+                <w:iCs w:val="false"/>
+                <w:sz w:val="20"/>
+                <w:szCs w:val="20"/>
+              </w:rPr>
+              <w:t xml:space="preserve">—</w:t>
+            </w:r>
+          </w:p>
+        </w:tc>
+        <w:tc>
+          <w:tcPr>
+            <w:tcW w:type="dxa" w:w="1860"/>
+            <w:tcBorders>
+              <w:top w:val="single" w:color="AAAAAA" w:sz="1"/>
+              <w:left w:val="single" w:color="AAAAAA" w:sz="1"/>
+              <w:bottom w:val="single" w:color="AAAAAA" w:sz="1"/>
+              <w:right w:val="single" w:color="AAAAAA" w:sz="1"/>
+            </w:tcBorders>
+            <w:tcMar>
+              <w:top w:type="dxa" w:w="60"/>
+              <w:left w:type="dxa" w:w="100"/>
+              <w:bottom w:type="dxa" w:w="60"/>
+              <w:right w:type="dxa" w:w="100"/>
+            </w:tcMar>
+          </w:tcPr>
+          <w:p>
+            <w:r>
+              <w:rPr>
+                <w:rFonts w:ascii="Arial" w:cs="Arial" w:eastAsia="Arial" w:hAnsi="Arial"/>
+                <w:b w:val="false"/>
+                <w:bCs w:val="false"/>
+                <w:i w:val="false"/>
+                <w:iCs w:val="false"/>
+                <w:color w:val="888888"/>
+                <w:sz w:val="16"/>
+                <w:szCs w:val="16"/>
+              </w:rPr>
+              <w:t xml:space="preserve">MR-MANAGE-DAT-022</w:t>
+            </w:r>
+          </w:p>
+        </w:tc>
+      </w:tr>
+      <w:tr>
+        <w:tc>
+          <w:tcPr>
+            <w:tcW w:type="dxa" w:w="9360"/>
+            <w:gridSpan w:val="6"/>
+            <w:tcBorders>
+              <w:top w:val="single" w:color="AAAAAA" w:sz="1"/>
+              <w:left w:val="single" w:color="AAAAAA" w:sz="1"/>
+              <w:bottom w:val="single" w:color="AAAAAA" w:sz="1"/>
+              <w:right w:val="single" w:color="AAAAAA" w:sz="1"/>
+            </w:tcBorders>
+            <w:tcMar>
+              <w:top w:type="dxa" w:w="40"/>
+              <w:left w:type="dxa" w:w="100"/>
+              <w:bottom w:type="dxa" w:w="80"/>
+              <w:right w:type="dxa" w:w="100"/>
+            </w:tcMar>
+          </w:tcPr>
+          <w:p>
+            <w:r>
+              <w:rPr>
+                <w:rFonts w:ascii="Arial" w:cs="Arial" w:eastAsia="Arial" w:hAnsi="Arial"/>
+                <w:b w:val="false"/>
+                <w:bCs w:val="false"/>
+                <w:i w:val="false"/>
+                <w:iCs w:val="false"/>
+                <w:color w:val="888888"/>
+                <w:sz w:val="20"/>
+                <w:szCs w:val="20"/>
+              </w:rPr>
+              <w:t xml:space="preserve">Sum of all session hours across all of the mentor’s engagements. System-calculated, read-only. Visible in list views and detail pages. </w:t>
+            </w:r>
+            <w:r>
+              <w:rPr>
+                <w:rFonts w:ascii="Arial" w:cs="Arial" w:eastAsia="Arial" w:hAnsi="Arial"/>
+                <w:b/>
+                <w:bCs/>
+                <w:i w:val="false"/>
+                <w:iCs w:val="false"/>
+                <w:color w:val="888888"/>
+                <w:sz w:val="20"/>
+                <w:szCs w:val="20"/>
+              </w:rPr>
+              <w:t xml:space="preserve">Domains: </w:t>
+            </w:r>
+            <w:r>
+              <w:rPr>
+                <w:rFonts w:ascii="Arial" w:cs="Arial" w:eastAsia="Arial" w:hAnsi="Arial"/>
+                <w:b w:val="false"/>
+                <w:bCs w:val="false"/>
+                <w:i w:val="false"/>
+                <w:iCs w:val="false"/>
+                <w:color w:val="888888"/>
+                <w:sz w:val="20"/>
+                <w:szCs w:val="20"/>
+              </w:rPr>
+              <w:t xml:space="preserve">MR. </w:t>
+            </w:r>
+            <w:r>
+              <w:rPr>
+                <w:rFonts w:ascii="Arial" w:cs="Arial" w:eastAsia="Arial" w:hAnsi="Arial"/>
+                <w:b/>
+                <w:bCs/>
+                <w:i w:val="false"/>
+                <w:iCs w:val="false"/>
+                <w:color w:val="888888"/>
+                <w:sz w:val="20"/>
+                <w:szCs w:val="20"/>
+              </w:rPr>
+              <w:t xml:space="preserve">Implementation: </w:t>
+            </w:r>
+            <w:r>
+              <w:rPr>
+                <w:rFonts w:ascii="Arial" w:cs="Arial" w:eastAsia="Arial" w:hAnsi="Arial"/>
+                <w:b w:val="false"/>
+                <w:bCs w:val="false"/>
+                <w:i w:val="false"/>
+                <w:iCs w:val="false"/>
+                <w:color w:val="888888"/>
+                <w:sz w:val="20"/>
+                <w:szCs w:val="20"/>
+              </w:rPr>
+              <w:t xml:space="preserve">system-calculated, readOnly.</w:t>
+            </w:r>
+          </w:p>
+        </w:tc>
+      </w:tr>
+      <w:tr>
+        <w:tc>
+          <w:tcPr>
+            <w:tcW w:type="dxa" w:w="2200"/>
+            <w:tcBorders>
+              <w:top w:val="single" w:color="AAAAAA" w:sz="1"/>
+              <w:left w:val="single" w:color="AAAAAA" w:sz="1"/>
+              <w:bottom w:val="single" w:color="AAAAAA" w:sz="1"/>
+              <w:right w:val="single" w:color="AAAAAA" w:sz="1"/>
+            </w:tcBorders>
+            <w:tcMar>
+              <w:top w:type="dxa" w:w="60"/>
+              <w:left w:type="dxa" w:w="100"/>
+              <w:bottom w:type="dxa" w:w="60"/>
+              <w:right w:type="dxa" w:w="100"/>
+            </w:tcMar>
+          </w:tcPr>
+          <w:p>
+            <w:r>
+              <w:rPr>
+                <w:rFonts w:ascii="Arial" w:cs="Arial" w:eastAsia="Arial" w:hAnsi="Arial"/>
+                <w:b/>
+                <w:bCs/>
+                <w:i w:val="false"/>
+                <w:iCs w:val="false"/>
+                <w:sz w:val="20"/>
+                <w:szCs w:val="20"/>
+              </w:rPr>
+              <w:t xml:space="preserve">totalSessionsLast30Days</w:t>
+            </w:r>
+          </w:p>
+        </w:tc>
+        <w:tc>
+          <w:tcPr>
+            <w:tcW w:type="dxa" w:w="1100"/>
+            <w:tcBorders>
+              <w:top w:val="single" w:color="AAAAAA" w:sz="1"/>
+              <w:left w:val="single" w:color="AAAAAA" w:sz="1"/>
+              <w:bottom w:val="single" w:color="AAAAAA" w:sz="1"/>
+              <w:right w:val="single" w:color="AAAAAA" w:sz="1"/>
+            </w:tcBorders>
+            <w:tcMar>
+              <w:top w:type="dxa" w:w="60"/>
+              <w:left w:type="dxa" w:w="100"/>
+              <w:bottom w:type="dxa" w:w="60"/>
+              <w:right w:type="dxa" w:w="100"/>
+            </w:tcMar>
+          </w:tcPr>
+          <w:p>
+            <w:r>
+              <w:rPr>
+                <w:rFonts w:ascii="Arial" w:cs="Arial" w:eastAsia="Arial" w:hAnsi="Arial"/>
+                <w:b w:val="false"/>
+                <w:bCs w:val="false"/>
+                <w:i w:val="false"/>
+                <w:iCs w:val="false"/>
+                <w:sz w:val="20"/>
+                <w:szCs w:val="20"/>
+              </w:rPr>
+              <w:t xml:space="preserve">int</w:t>
+            </w:r>
+          </w:p>
+        </w:tc>
+        <w:tc>
+          <w:tcPr>
+            <w:tcW w:type="dxa" w:w="800"/>
+            <w:tcBorders>
+              <w:top w:val="single" w:color="AAAAAA" w:sz="1"/>
+              <w:left w:val="single" w:color="AAAAAA" w:sz="1"/>
+              <w:bottom w:val="single" w:color="AAAAAA" w:sz="1"/>
+              <w:right w:val="single" w:color="AAAAAA" w:sz="1"/>
+            </w:tcBorders>
+            <w:tcMar>
+              <w:top w:type="dxa" w:w="60"/>
+              <w:left w:type="dxa" w:w="100"/>
+              <w:bottom w:type="dxa" w:w="60"/>
+              <w:right w:type="dxa" w:w="100"/>
+            </w:tcMar>
+          </w:tcPr>
+          <w:p>
+            <w:r>
+              <w:rPr>
+                <w:rFonts w:ascii="Arial" w:cs="Arial" w:eastAsia="Arial" w:hAnsi="Arial"/>
+                <w:b w:val="false"/>
+                <w:bCs w:val="false"/>
+                <w:i w:val="false"/>
+                <w:iCs w:val="false"/>
+                <w:sz w:val="20"/>
+                <w:szCs w:val="20"/>
+              </w:rPr>
+              <w:t xml:space="preserve">System</w:t>
+            </w:r>
+          </w:p>
+        </w:tc>
+        <w:tc>
+          <w:tcPr>
+            <w:tcW w:type="dxa" w:w="2400"/>
+            <w:tcBorders>
+              <w:top w:val="single" w:color="AAAAAA" w:sz="1"/>
+              <w:left w:val="single" w:color="AAAAAA" w:sz="1"/>
+              <w:bottom w:val="single" w:color="AAAAAA" w:sz="1"/>
+              <w:right w:val="single" w:color="AAAAAA" w:sz="1"/>
+            </w:tcBorders>
+            <w:tcMar>
+              <w:top w:type="dxa" w:w="60"/>
+              <w:left w:type="dxa" w:w="100"/>
+              <w:bottom w:type="dxa" w:w="60"/>
+              <w:right w:type="dxa" w:w="100"/>
+            </w:tcMar>
+          </w:tcPr>
+          <w:p>
+            <w:r>
+              <w:rPr>
+                <w:rFonts w:ascii="Arial" w:cs="Arial" w:eastAsia="Arial" w:hAnsi="Arial"/>
+                <w:b w:val="false"/>
+                <w:bCs w:val="false"/>
+                <w:i w:val="false"/>
+                <w:iCs w:val="false"/>
+                <w:sz w:val="20"/>
+                <w:szCs w:val="20"/>
+              </w:rPr>
+              <w:t xml:space="preserve">—</w:t>
+            </w:r>
+          </w:p>
+        </w:tc>
+        <w:tc>
+          <w:tcPr>
+            <w:tcW w:type="dxa" w:w="1000"/>
+            <w:tcBorders>
+              <w:top w:val="single" w:color="AAAAAA" w:sz="1"/>
+              <w:left w:val="single" w:color="AAAAAA" w:sz="1"/>
+              <w:bottom w:val="single" w:color="AAAAAA" w:sz="1"/>
+              <w:right w:val="single" w:color="AAAAAA" w:sz="1"/>
+            </w:tcBorders>
+            <w:tcMar>
+              <w:top w:type="dxa" w:w="60"/>
+              <w:left w:type="dxa" w:w="100"/>
+              <w:bottom w:type="dxa" w:w="60"/>
+              <w:right w:type="dxa" w:w="100"/>
+            </w:tcMar>
+          </w:tcPr>
+          <w:p>
+            <w:r>
+              <w:rPr>
+                <w:rFonts w:ascii="Arial" w:cs="Arial" w:eastAsia="Arial" w:hAnsi="Arial"/>
+                <w:b w:val="false"/>
+                <w:bCs w:val="false"/>
+                <w:i w:val="false"/>
+                <w:iCs w:val="false"/>
+                <w:sz w:val="20"/>
+                <w:szCs w:val="20"/>
+              </w:rPr>
+              <w:t xml:space="preserve">—</w:t>
+            </w:r>
+          </w:p>
+        </w:tc>
+        <w:tc>
+          <w:tcPr>
+            <w:tcW w:type="dxa" w:w="1860"/>
+            <w:tcBorders>
+              <w:top w:val="single" w:color="AAAAAA" w:sz="1"/>
+              <w:left w:val="single" w:color="AAAAAA" w:sz="1"/>
+              <w:bottom w:val="single" w:color="AAAAAA" w:sz="1"/>
+              <w:right w:val="single" w:color="AAAAAA" w:sz="1"/>
+            </w:tcBorders>
+            <w:tcMar>
+              <w:top w:type="dxa" w:w="60"/>
+              <w:left w:type="dxa" w:w="100"/>
+              <w:bottom w:type="dxa" w:w="60"/>
+              <w:right w:type="dxa" w:w="100"/>
+            </w:tcMar>
+          </w:tcPr>
+          <w:p>
+            <w:r>
+              <w:rPr>
+                <w:rFonts w:ascii="Arial" w:cs="Arial" w:eastAsia="Arial" w:hAnsi="Arial"/>
+                <w:b w:val="false"/>
+                <w:bCs w:val="false"/>
+                <w:i w:val="false"/>
+                <w:iCs w:val="false"/>
+                <w:color w:val="888888"/>
+                <w:sz w:val="16"/>
+                <w:szCs w:val="16"/>
+              </w:rPr>
+              <w:t xml:space="preserve">MR-MANAGE-DAT-023</w:t>
+            </w:r>
+          </w:p>
+        </w:tc>
+      </w:tr>
+      <w:tr>
+        <w:tc>
+          <w:tcPr>
+            <w:tcW w:type="dxa" w:w="9360"/>
+            <w:gridSpan w:val="6"/>
+            <w:tcBorders>
+              <w:top w:val="single" w:color="AAAAAA" w:sz="1"/>
+              <w:left w:val="single" w:color="AAAAAA" w:sz="1"/>
+              <w:bottom w:val="single" w:color="AAAAAA" w:sz="1"/>
+              <w:right w:val="single" w:color="AAAAAA" w:sz="1"/>
+            </w:tcBorders>
+            <w:tcMar>
+              <w:top w:type="dxa" w:w="40"/>
+              <w:left w:type="dxa" w:w="100"/>
+              <w:bottom w:type="dxa" w:w="80"/>
+              <w:right w:type="dxa" w:w="100"/>
+            </w:tcMar>
+          </w:tcPr>
+          <w:p>
+            <w:r>
+              <w:rPr>
+                <w:rFonts w:ascii="Arial" w:cs="Arial" w:eastAsia="Arial" w:hAnsi="Arial"/>
+                <w:b w:val="false"/>
+                <w:bCs w:val="false"/>
+                <w:i w:val="false"/>
+                <w:iCs w:val="false"/>
+                <w:color w:val="888888"/>
+                <w:sz w:val="20"/>
+                <w:szCs w:val="20"/>
+              </w:rPr>
+              <w:t xml:space="preserve">Count of completed sessions in a rolling 30-day window across all of the mentor’s engagements. System-calculated, read-only. Visible in list views and detail pages. </w:t>
+            </w:r>
+            <w:r>
+              <w:rPr>
+                <w:rFonts w:ascii="Arial" w:cs="Arial" w:eastAsia="Arial" w:hAnsi="Arial"/>
+                <w:b/>
+                <w:bCs/>
+                <w:i w:val="false"/>
+                <w:iCs w:val="false"/>
+                <w:color w:val="888888"/>
+                <w:sz w:val="20"/>
+                <w:szCs w:val="20"/>
+              </w:rPr>
+              <w:t xml:space="preserve">Domains: </w:t>
+            </w:r>
+            <w:r>
+              <w:rPr>
+                <w:rFonts w:ascii="Arial" w:cs="Arial" w:eastAsia="Arial" w:hAnsi="Arial"/>
+                <w:b w:val="false"/>
+                <w:bCs w:val="false"/>
+                <w:i w:val="false"/>
+                <w:iCs w:val="false"/>
+                <w:color w:val="888888"/>
+                <w:sz w:val="20"/>
+                <w:szCs w:val="20"/>
+              </w:rPr>
+              <w:t xml:space="preserve">MR. </w:t>
+            </w:r>
+            <w:r>
+              <w:rPr>
+                <w:rFonts w:ascii="Arial" w:cs="Arial" w:eastAsia="Arial" w:hAnsi="Arial"/>
+                <w:b/>
+                <w:bCs/>
+                <w:i w:val="false"/>
+                <w:iCs w:val="false"/>
+                <w:color w:val="888888"/>
+                <w:sz w:val="20"/>
+                <w:szCs w:val="20"/>
+              </w:rPr>
+              <w:t xml:space="preserve">Implementation: </w:t>
+            </w:r>
+            <w:r>
+              <w:rPr>
+                <w:rFonts w:ascii="Arial" w:cs="Arial" w:eastAsia="Arial" w:hAnsi="Arial"/>
+                <w:b w:val="false"/>
+                <w:bCs w:val="false"/>
+                <w:i w:val="false"/>
+                <w:iCs w:val="false"/>
+                <w:color w:val="888888"/>
+                <w:sz w:val="20"/>
+                <w:szCs w:val="20"/>
+              </w:rPr>
+              <w:t xml:space="preserve">system-calculated, readOnly.</w:t>
+            </w:r>
+          </w:p>
+        </w:tc>
+      </w:tr>
+    </w:tbl>
+    <w:p>
+      <w:pPr>
+        <w:spacing w:after="120"/>
+      </w:pPr>
+      <w:r>
+        <w:rPr>
+          <w:rFonts w:ascii="Arial" w:cs="Arial" w:eastAsia="Arial" w:hAnsi="Arial"/>
+          <w:b w:val="false"/>
+          <w:bCs w:val="false"/>
+          <w:i w:val="false"/>
+          <w:iCs w:val="false"/>
+          <w:sz w:val="22"/>
+          <w:szCs w:val="22"/>
+        </w:rPr>
+        <w:t xml:space="preserve"/>
+      </w:r>
+    </w:p>
+    <w:p>
+      <w:pPr>
+        <w:spacing w:after="120"/>
+      </w:pPr>
+      <w:r>
+        <w:rPr>
+          <w:rFonts w:ascii="Arial" w:cs="Arial" w:eastAsia="Arial" w:hAnsi="Arial"/>
+          <w:b/>
+          <w:bCs/>
+          <w:i w:val="false"/>
+          <w:iCs w:val="false"/>
+          <w:color w:val="1F3864"/>
+          <w:sz w:val="22"/>
+          <w:szCs w:val="22"/>
+        </w:rPr>
         <w:t xml:space="preserve">Departure</w:t>
       </w:r>
     </w:p>
@@ -15408,7 +17007,7 @@
                 <w:sz w:val="20"/>
                 <w:szCs w:val="20"/>
               </w:rPr>
-              <w:t xml:space="preserve">Reason the mentor exited CBM. Shown only when mentorStatus = Departed. Set by Mentor Administrator at offboarding. </w:t>
+              <w:t xml:space="preserve">Reason the mentor exited CBM. Shown only when mentorStatus in [Resigned, Departed]. Set by Mentor Administrator at offboarding. </w:t>
             </w:r>
             <w:r>
               <w:rPr>
@@ -15460,7 +17059,7 @@
                 <w:sz w:val="20"/>
                 <w:szCs w:val="20"/>
               </w:rPr>
-              <w:t xml:space="preserve">admin-only. Dynamic logic: visible when mentorStatus = Departed.</w:t>
+              <w:t xml:space="preserve">admin-only. Dynamic logic: visible when mentorStatus in [Resigned, Departed].</w:t>
             </w:r>
           </w:p>
         </w:tc>
@@ -15691,7 +17290,7 @@
                 <w:sz w:val="20"/>
                 <w:szCs w:val="20"/>
               </w:rPr>
-              <w:t xml:space="preserve">Date the mentor formally departed. Shown only when mentorStatus = Departed. </w:t>
+              <w:t xml:space="preserve">Date the mentor formally departed. Shown only when mentorStatus in [Resigned, Departed]. </w:t>
             </w:r>
             <w:r>
               <w:rPr>
@@ -15743,7 +17342,7 @@
                 <w:sz w:val="20"/>
                 <w:szCs w:val="20"/>
               </w:rPr>
-              <w:t xml:space="preserve">admin-only. Dynamic logic: visible when mentorStatus = Departed.</w:t>
+              <w:t xml:space="preserve">admin-only. Dynamic logic: visible when mentorStatus in [Resigned, Departed].</w:t>
             </w:r>
           </w:p>
         </w:tc>
@@ -18079,7 +19678,7 @@
           <w:sz w:val="22"/>
           <w:szCs w:val="22"/>
         </w:rPr>
-        <w:t xml:space="preserve">mentorStatus, acceptingNewClients, maximumClientCapacity, currentActiveClients, availableCapacity, personalEmail, cbmEmailAddress, currentEmployer, currentlyEmployed, yearsOfBusinessExperience, professionalBio, industrySectors, mentoringFocusAreas, skillsExpertiseTags, fluentLanguages, whyInterestedInMentoring, isPrimaryMentor, isCoMentor, isSubjectMatterExpert, ethicsAgreementAccepted, ethicsAgreementAcceptanceDateTime, backgroundCheckCompleted, backgroundCheckDate, felonyConvictionDisclosure, trainingCompleted, trainingCompletionDate, duesStatus, duesPaymentDate, departureReason, departureDate</w:t>
+        <w:t xml:space="preserve">mentorStatus, acceptingNewClients, maximumClientCapacity, currentActiveClients, availableCapacity, personalEmail, cbmEmailAddress, currentEmployer, currentlyEmployed, yearsOfBusinessExperience, professionalBio, industrySectors, mentoringFocusAreas, skillsExpertiseTags, fluentLanguages, whyInterestedInMentoring, isPrimaryMentor, isCoMentor, isSubjectMatterExpert, ethicsAgreementAccepted, ethicsAgreementAcceptanceDateTime, backgroundCheckCompleted, backgroundCheckDate, felonyConvictionDisclosure, trainingCompleted, trainingCompletionDate, duesStatus, duesPaymentDate, applicationDeclineReason, totalLifetimeSessions, totalMentoringHours, totalSessionsLast30Days, departureReason, departureDate</w:t>
       </w:r>
     </w:p>
     <w:p>
@@ -18137,6 +19736,39 @@
           <w:sz w:val="22"/>
           <w:szCs w:val="22"/>
         </w:rPr>
+        <w:t xml:space="preserve">applicationDeclineReason</w:t>
+      </w:r>
+      <w:r>
+        <w:rPr>
+          <w:rFonts w:ascii="Arial" w:cs="Arial" w:eastAsia="Arial" w:hAnsi="Arial"/>
+          <w:b w:val="false"/>
+          <w:bCs w:val="false"/>
+          <w:i w:val="false"/>
+          <w:iCs w:val="false"/>
+          <w:sz w:val="22"/>
+          <w:szCs w:val="22"/>
+        </w:rPr>
+        <w:t xml:space="preserve"> — visible only when mentorStatus = Declined</w:t>
+      </w:r>
+    </w:p>
+    <w:p>
+      <w:pPr>
+        <w:numPr>
+          <w:ilvl w:val="0"/>
+          <w:numId w:val="2"/>
+        </w:numPr>
+        <w:spacing w:after="60"/>
+      </w:pPr>
+      <w:r>
+        <w:rPr>
+          <w:rFonts w:ascii="Arial" w:cs="Arial" w:eastAsia="Arial" w:hAnsi="Arial"/>
+          <w:b/>
+          <w:bCs/>
+          <w:i w:val="false"/>
+          <w:iCs w:val="false"/>
+          <w:sz w:val="22"/>
+          <w:szCs w:val="22"/>
+        </w:rPr>
         <w:t xml:space="preserve">departureReason, departureDate</w:t>
       </w:r>
       <w:r>
@@ -18149,7 +19781,7 @@
           <w:sz w:val="22"/>
           <w:szCs w:val="22"/>
         </w:rPr>
-        <w:t xml:space="preserve"> — visible only when mentorStatus = Departed</w:t>
+        <w:t xml:space="preserve"> — visible only when mentorStatus in [Resigned, Departed]</w:t>
       </w:r>
     </w:p>
     <w:p>
@@ -18562,7 +20194,7 @@
           <w:sz w:val="22"/>
           <w:szCs w:val="22"/>
         </w:rPr>
-        <w:t xml:space="preserve">Mentor Departure Panel (mentorStatus = Departed)</w:t>
+        <w:t xml:space="preserve">Mentor Departure Panel (mentorStatus in [Resigned, Departed])</w:t>
       </w:r>
     </w:p>
     <w:p>
@@ -18720,7 +20352,7 @@
           <w:sz w:val="22"/>
           <w:szCs w:val="22"/>
         </w:rPr>
-        <w:t xml:space="preserve">termsAndConditionsAccepted and termsAndConditionsAcceptanceDateTime are populated from form submissions. trainingCompleted and trainingCompletionDate are populated via LMS integration. felonyConvictionDisclosure is populated from the application form. None of these fields should be manually editable by end users.</w:t>
+        <w:t xml:space="preserve">termsAndConditionsAccepted and termsAndConditionsAcceptanceDateTime are populated from form submissions. trainingCompleted and trainingCompletionDate are populated via LMS integration but may also be manually set by the Mentor Administrator as a fallback. felonyConvictionDisclosure is populated from the application form. termsAndConditionsAccepted, termsAndConditionsAcceptanceDateTime, and felonyConvictionDisclosure should not be manually editable by end users.</w:t>
       </w:r>
     </w:p>
     <w:p>

</xml_diff>

<commit_message>
Contact Entity PRD v1.1: add duesRenewalDate field (DUES-DEC-005)
</commit_message>
<xml_diff>
--- a/PRDs/entities/Contact-Entity-PRD.docx
+++ b/PRDs/entities/Contact-Entity-PRD.docx
@@ -309,7 +309,7 @@
                 <w:sz w:val="20"/>
                 <w:szCs w:val="20"/>
               </w:rPr>
-              <w:t xml:space="preserve">1.0</w:t>
+              <w:t xml:space="preserve">1.1</w:t>
             </w:r>
           </w:p>
         </w:tc>
@@ -439,7 +439,7 @@
                 <w:sz w:val="20"/>
                 <w:szCs w:val="20"/>
               </w:rPr>
-              <w:t xml:space="preserve">04-05-26 22:00</w:t>
+              <w:t xml:space="preserve">04-05-26 22:15</w:t>
             </w:r>
           </w:p>
         </w:tc>
@@ -14929,6 +14929,282 @@
                 <w:szCs w:val="20"/>
               </w:rPr>
               <w:t xml:space="preserve">admin-only.</w:t>
+            </w:r>
+          </w:p>
+        </w:tc>
+      </w:tr>
+      <w:tr>
+        <w:tc>
+          <w:tcPr>
+            <w:tcW w:type="dxa" w:w="2200"/>
+            <w:tcBorders>
+              <w:top w:val="single" w:color="AAAAAA" w:sz="1"/>
+              <w:left w:val="single" w:color="AAAAAA" w:sz="1"/>
+              <w:bottom w:val="single" w:color="AAAAAA" w:sz="1"/>
+              <w:right w:val="single" w:color="AAAAAA" w:sz="1"/>
+            </w:tcBorders>
+            <w:tcMar>
+              <w:top w:type="dxa" w:w="60"/>
+              <w:left w:type="dxa" w:w="100"/>
+              <w:bottom w:type="dxa" w:w="60"/>
+              <w:right w:type="dxa" w:w="100"/>
+            </w:tcMar>
+          </w:tcPr>
+          <w:p>
+            <w:r>
+              <w:rPr>
+                <w:rFonts w:ascii="Arial" w:cs="Arial" w:eastAsia="Arial" w:hAnsi="Arial"/>
+                <w:b/>
+                <w:bCs/>
+                <w:i w:val="false"/>
+                <w:iCs w:val="false"/>
+                <w:sz w:val="20"/>
+                <w:szCs w:val="20"/>
+              </w:rPr>
+              <w:t xml:space="preserve">duesRenewalDate</w:t>
+            </w:r>
+          </w:p>
+        </w:tc>
+        <w:tc>
+          <w:tcPr>
+            <w:tcW w:type="dxa" w:w="1100"/>
+            <w:tcBorders>
+              <w:top w:val="single" w:color="AAAAAA" w:sz="1"/>
+              <w:left w:val="single" w:color="AAAAAA" w:sz="1"/>
+              <w:bottom w:val="single" w:color="AAAAAA" w:sz="1"/>
+              <w:right w:val="single" w:color="AAAAAA" w:sz="1"/>
+            </w:tcBorders>
+            <w:tcMar>
+              <w:top w:type="dxa" w:w="60"/>
+              <w:left w:type="dxa" w:w="100"/>
+              <w:bottom w:type="dxa" w:w="60"/>
+              <w:right w:type="dxa" w:w="100"/>
+            </w:tcMar>
+          </w:tcPr>
+          <w:p>
+            <w:r>
+              <w:rPr>
+                <w:rFonts w:ascii="Arial" w:cs="Arial" w:eastAsia="Arial" w:hAnsi="Arial"/>
+                <w:b w:val="false"/>
+                <w:bCs w:val="false"/>
+                <w:i w:val="false"/>
+                <w:iCs w:val="false"/>
+                <w:sz w:val="20"/>
+                <w:szCs w:val="20"/>
+              </w:rPr>
+              <w:t xml:space="preserve">date</w:t>
+            </w:r>
+          </w:p>
+        </w:tc>
+        <w:tc>
+          <w:tcPr>
+            <w:tcW w:type="dxa" w:w="800"/>
+            <w:tcBorders>
+              <w:top w:val="single" w:color="AAAAAA" w:sz="1"/>
+              <w:left w:val="single" w:color="AAAAAA" w:sz="1"/>
+              <w:bottom w:val="single" w:color="AAAAAA" w:sz="1"/>
+              <w:right w:val="single" w:color="AAAAAA" w:sz="1"/>
+            </w:tcBorders>
+            <w:tcMar>
+              <w:top w:type="dxa" w:w="60"/>
+              <w:left w:type="dxa" w:w="100"/>
+              <w:bottom w:type="dxa" w:w="60"/>
+              <w:right w:type="dxa" w:w="100"/>
+            </w:tcMar>
+          </w:tcPr>
+          <w:p>
+            <w:r>
+              <w:rPr>
+                <w:rFonts w:ascii="Arial" w:cs="Arial" w:eastAsia="Arial" w:hAnsi="Arial"/>
+                <w:b w:val="false"/>
+                <w:bCs w:val="false"/>
+                <w:i w:val="false"/>
+                <w:iCs w:val="false"/>
+                <w:sz w:val="20"/>
+                <w:szCs w:val="20"/>
+              </w:rPr>
+              <w:t xml:space="preserve">No</w:t>
+            </w:r>
+          </w:p>
+        </w:tc>
+        <w:tc>
+          <w:tcPr>
+            <w:tcW w:type="dxa" w:w="2400"/>
+            <w:tcBorders>
+              <w:top w:val="single" w:color="AAAAAA" w:sz="1"/>
+              <w:left w:val="single" w:color="AAAAAA" w:sz="1"/>
+              <w:bottom w:val="single" w:color="AAAAAA" w:sz="1"/>
+              <w:right w:val="single" w:color="AAAAAA" w:sz="1"/>
+            </w:tcBorders>
+            <w:tcMar>
+              <w:top w:type="dxa" w:w="60"/>
+              <w:left w:type="dxa" w:w="100"/>
+              <w:bottom w:type="dxa" w:w="60"/>
+              <w:right w:type="dxa" w:w="100"/>
+            </w:tcMar>
+          </w:tcPr>
+          <w:p>
+            <w:r>
+              <w:rPr>
+                <w:rFonts w:ascii="Arial" w:cs="Arial" w:eastAsia="Arial" w:hAnsi="Arial"/>
+                <w:b w:val="false"/>
+                <w:bCs w:val="false"/>
+                <w:i w:val="false"/>
+                <w:iCs w:val="false"/>
+                <w:sz w:val="20"/>
+                <w:szCs w:val="20"/>
+              </w:rPr>
+              <w:t xml:space="preserve">—</w:t>
+            </w:r>
+          </w:p>
+        </w:tc>
+        <w:tc>
+          <w:tcPr>
+            <w:tcW w:type="dxa" w:w="1000"/>
+            <w:tcBorders>
+              <w:top w:val="single" w:color="AAAAAA" w:sz="1"/>
+              <w:left w:val="single" w:color="AAAAAA" w:sz="1"/>
+              <w:bottom w:val="single" w:color="AAAAAA" w:sz="1"/>
+              <w:right w:val="single" w:color="AAAAAA" w:sz="1"/>
+            </w:tcBorders>
+            <w:tcMar>
+              <w:top w:type="dxa" w:w="60"/>
+              <w:left w:type="dxa" w:w="100"/>
+              <w:bottom w:type="dxa" w:w="60"/>
+              <w:right w:type="dxa" w:w="100"/>
+            </w:tcMar>
+          </w:tcPr>
+          <w:p>
+            <w:r>
+              <w:rPr>
+                <w:rFonts w:ascii="Arial" w:cs="Arial" w:eastAsia="Arial" w:hAnsi="Arial"/>
+                <w:b w:val="false"/>
+                <w:bCs w:val="false"/>
+                <w:i w:val="false"/>
+                <w:iCs w:val="false"/>
+                <w:sz w:val="20"/>
+                <w:szCs w:val="20"/>
+              </w:rPr>
+              <w:t xml:space="preserve">—</w:t>
+            </w:r>
+          </w:p>
+        </w:tc>
+        <w:tc>
+          <w:tcPr>
+            <w:tcW w:type="dxa" w:w="1860"/>
+            <w:tcBorders>
+              <w:top w:val="single" w:color="AAAAAA" w:sz="1"/>
+              <w:left w:val="single" w:color="AAAAAA" w:sz="1"/>
+              <w:bottom w:val="single" w:color="AAAAAA" w:sz="1"/>
+              <w:right w:val="single" w:color="AAAAAA" w:sz="1"/>
+            </w:tcBorders>
+            <w:tcMar>
+              <w:top w:type="dxa" w:w="60"/>
+              <w:left w:type="dxa" w:w="100"/>
+              <w:bottom w:type="dxa" w:w="60"/>
+              <w:right w:type="dxa" w:w="100"/>
+            </w:tcMar>
+          </w:tcPr>
+          <w:p>
+            <w:r>
+              <w:rPr>
+                <w:rFonts w:ascii="Arial" w:cs="Arial" w:eastAsia="Arial" w:hAnsi="Arial"/>
+                <w:b w:val="false"/>
+                <w:bCs w:val="false"/>
+                <w:i w:val="false"/>
+                <w:iCs w:val="false"/>
+                <w:color w:val="888888"/>
+                <w:sz w:val="16"/>
+                <w:szCs w:val="16"/>
+              </w:rPr>
+              <w:t xml:space="preserve">DUES-DEC-005</w:t>
+            </w:r>
+          </w:p>
+        </w:tc>
+      </w:tr>
+      <w:tr>
+        <w:tc>
+          <w:tcPr>
+            <w:tcW w:type="dxa" w:w="9360"/>
+            <w:gridSpan w:val="6"/>
+            <w:tcBorders>
+              <w:top w:val="single" w:color="AAAAAA" w:sz="1"/>
+              <w:left w:val="single" w:color="AAAAAA" w:sz="1"/>
+              <w:bottom w:val="single" w:color="AAAAAA" w:sz="1"/>
+              <w:right w:val="single" w:color="AAAAAA" w:sz="1"/>
+            </w:tcBorders>
+            <w:tcMar>
+              <w:top w:type="dxa" w:w="40"/>
+              <w:left w:type="dxa" w:w="100"/>
+              <w:bottom w:type="dxa" w:w="80"/>
+              <w:right w:type="dxa" w:w="100"/>
+            </w:tcMar>
+          </w:tcPr>
+          <w:p>
+            <w:r>
+              <w:rPr>
+                <w:rFonts w:ascii="Arial" w:cs="Arial" w:eastAsia="Arial" w:hAnsi="Arial"/>
+                <w:b w:val="false"/>
+                <w:bCs w:val="false"/>
+                <w:i w:val="false"/>
+                <w:iCs w:val="false"/>
+                <w:color w:val="888888"/>
+                <w:sz w:val="20"/>
+                <w:szCs w:val="20"/>
+              </w:rPr>
+              <w:t xml:space="preserve">The mentor’s annual dues renewal date, derived from their activation anniversary. Used by the Mentor Administrator to determine when to create each year’s Dues record. </w:t>
+            </w:r>
+            <w:r>
+              <w:rPr>
+                <w:rFonts w:ascii="Arial" w:cs="Arial" w:eastAsia="Arial" w:hAnsi="Arial"/>
+                <w:b/>
+                <w:bCs/>
+                <w:i w:val="false"/>
+                <w:iCs w:val="false"/>
+                <w:color w:val="888888"/>
+                <w:sz w:val="20"/>
+                <w:szCs w:val="20"/>
+              </w:rPr>
+              <w:t xml:space="preserve">Domains: </w:t>
+            </w:r>
+            <w:r>
+              <w:rPr>
+                <w:rFonts w:ascii="Arial" w:cs="Arial" w:eastAsia="Arial" w:hAnsi="Arial"/>
+                <w:b w:val="false"/>
+                <w:bCs w:val="false"/>
+                <w:i w:val="false"/>
+                <w:iCs w:val="false"/>
+                <w:color w:val="888888"/>
+                <w:sz w:val="20"/>
+                <w:szCs w:val="20"/>
+              </w:rPr>
+              <w:t xml:space="preserve">MR. </w:t>
+            </w:r>
+            <w:r>
+              <w:rPr>
+                <w:rFonts w:ascii="Arial" w:cs="Arial" w:eastAsia="Arial" w:hAnsi="Arial"/>
+                <w:b/>
+                <w:bCs/>
+                <w:i w:val="false"/>
+                <w:iCs w:val="false"/>
+                <w:color w:val="888888"/>
+                <w:sz w:val="20"/>
+                <w:szCs w:val="20"/>
+              </w:rPr>
+              <w:t xml:space="preserve">Implementation: </w:t>
+            </w:r>
+            <w:r>
+              <w:rPr>
+                <w:rFonts w:ascii="Arial" w:cs="Arial" w:eastAsia="Arial" w:hAnsi="Arial"/>
+                <w:b w:val="false"/>
+                <w:bCs w:val="false"/>
+                <w:i w:val="false"/>
+                <w:iCs w:val="false"/>
+                <w:color w:val="888888"/>
+                <w:sz w:val="20"/>
+                <w:szCs w:val="20"/>
+              </w:rPr>
+              <w:t xml:space="preserve">admin-only. Added from Dues Entity PRD (DUES-DEC-005).</w:t>
             </w:r>
           </w:p>
         </w:tc>
@@ -19678,7 +19954,7 @@
           <w:sz w:val="22"/>
           <w:szCs w:val="22"/>
         </w:rPr>
-        <w:t xml:space="preserve">mentorStatus, acceptingNewClients, maximumClientCapacity, currentActiveClients, availableCapacity, personalEmail, cbmEmailAddress, currentEmployer, currentlyEmployed, yearsOfBusinessExperience, professionalBio, industrySectors, mentoringFocusAreas, skillsExpertiseTags, fluentLanguages, whyInterestedInMentoring, isPrimaryMentor, isCoMentor, isSubjectMatterExpert, ethicsAgreementAccepted, ethicsAgreementAcceptanceDateTime, backgroundCheckCompleted, backgroundCheckDate, felonyConvictionDisclosure, trainingCompleted, trainingCompletionDate, duesStatus, duesPaymentDate, applicationDeclineReason, totalLifetimeSessions, totalMentoringHours, totalSessionsLast30Days, departureReason, departureDate</w:t>
+        <w:t xml:space="preserve">mentorStatus, acceptingNewClients, maximumClientCapacity, currentActiveClients, availableCapacity, personalEmail, cbmEmailAddress, currentEmployer, currentlyEmployed, yearsOfBusinessExperience, professionalBio, industrySectors, mentoringFocusAreas, skillsExpertiseTags, fluentLanguages, whyInterestedInMentoring, isPrimaryMentor, isCoMentor, isSubjectMatterExpert, ethicsAgreementAccepted, ethicsAgreementAcceptanceDateTime, backgroundCheckCompleted, backgroundCheckDate, felonyConvictionDisclosure, trainingCompleted, trainingCompletionDate, duesStatus, duesPaymentDate, duesRenewalDate, applicationDeclineReason, totalLifetimeSessions, totalMentoringHours, totalSessionsLast30Days, departureReason, departureDate</w:t>
       </w:r>
     </w:p>
     <w:p>
@@ -20176,7 +20452,7 @@
           <w:sz w:val="22"/>
           <w:szCs w:val="22"/>
         </w:rPr>
-        <w:t xml:space="preserve">duesStatus, duesPaymentDate.</w:t>
+        <w:t xml:space="preserve">duesStatus, duesPaymentDate, duesRenewalDate.</w:t>
       </w:r>
     </w:p>
     <w:p>
@@ -20323,7 +20599,7 @@
           <w:sz w:val="22"/>
           <w:szCs w:val="22"/>
         </w:rPr>
-        <w:t xml:space="preserve">backgroundCheckCompleted, backgroundCheckDate, and felonyConvictionDisclosure are restricted to Mentor Administrator access only and hidden from the mentor’s own record view. duesStatus, duesPaymentDate, departureReason, and departureDate are admin-only. ethicsAgreementAccepted is read-only for mentors.</w:t>
+        <w:t xml:space="preserve">backgroundCheckCompleted, backgroundCheckDate, and felonyConvictionDisclosure are restricted to Mentor Administrator access only and hidden from the mentor’s own record view. duesStatus, duesPaymentDate, duesRenewalDate, departureReason, and departureDate are admin-only. ethicsAgreementAccepted is read-only for mentors.</w:t>
       </w:r>
     </w:p>
     <w:p>

</xml_diff>